<commit_message>
refactor(core-ui-pdf-crypto): Enhance UI, PDF signature handling, and trust store logic
- Refactor UI button creation for better consistency and tooltip handling.
- Improve PDF signature verification to associate visual locations on pages.
- Enhance trust store manager to check issuer-principal relationships for trust anchors.
- Update error handling in MainWindow to suppress alerts for user-cancelled operations.
</commit_message>
<xml_diff>
--- a/samples/sample_document.docx
+++ b/samples/sample_document.docx
@@ -8,7 +8,7 @@
       </w:pPr>
       <w:r>
         <w:rPr>
-          <w:rFonts w:ascii="Segoe UI" w:hAnsi="Segoe UI" w:cs="Segoe UI" w:eastAsia="Segoe UI"/>
+          <w:rFonts w:ascii="Calibri" w:hAnsi="Calibri" w:cs="Calibri" w:eastAsia="Calibri"/>
           <w:sz w:val="48"/>
           <w:b w:val="on"/>
           <w:i w:val="off"/>
@@ -24,7 +24,7 @@
       </w:pPr>
       <w:r>
         <w:rPr>
-          <w:rFonts w:ascii="Segoe UI" w:hAnsi="Segoe UI" w:cs="Segoe UI" w:eastAsia="Segoe UI"/>
+          <w:rFonts w:ascii="Calibri" w:hAnsi="Calibri" w:cs="Calibri" w:eastAsia="Calibri"/>
           <w:sz w:val="26"/>
           <w:b w:val="off"/>
           <w:i w:val="on"/>
@@ -41,7 +41,7 @@
       </w:pPr>
       <w:r>
         <w:rPr>
-          <w:rFonts w:ascii="Segoe UI" w:hAnsi="Segoe UI" w:cs="Segoe UI" w:eastAsia="Segoe UI"/>
+          <w:rFonts w:ascii="Calibri" w:hAnsi="Calibri" w:cs="Calibri" w:eastAsia="Calibri"/>
           <w:sz w:val="36"/>
           <w:b w:val="on"/>
           <w:i w:val="off"/>
@@ -57,7 +57,7 @@
       </w:pPr>
       <w:r>
         <w:rPr>
-          <w:rFonts w:ascii="Segoe UI" w:hAnsi="Segoe UI" w:cs="Segoe UI" w:eastAsia="Segoe UI"/>
+          <w:rFonts w:ascii="Calibri" w:hAnsi="Calibri" w:cs="Calibri" w:eastAsia="Calibri"/>
           <w:sz w:val="22"/>
           <w:b w:val="off"/>
           <w:i w:val="off"/>
@@ -74,7 +74,7 @@
       </w:pPr>
       <w:r>
         <w:rPr>
-          <w:rFonts w:ascii="Segoe UI" w:hAnsi="Segoe UI" w:cs="Segoe UI" w:eastAsia="Segoe UI"/>
+          <w:rFonts w:ascii="Calibri" w:hAnsi="Calibri" w:cs="Calibri" w:eastAsia="Calibri"/>
           <w:sz w:val="28"/>
           <w:b w:val="on"/>
           <w:i w:val="off"/>
@@ -90,7 +90,7 @@
       </w:pPr>
       <w:r>
         <w:rPr>
-          <w:rFonts w:ascii="Segoe UI" w:hAnsi="Segoe UI" w:cs="Segoe UI" w:eastAsia="Segoe UI"/>
+          <w:rFonts w:ascii="Calibri" w:hAnsi="Calibri" w:cs="Calibri" w:eastAsia="Calibri"/>
           <w:sz w:val="22"/>
           <w:b w:val="off"/>
           <w:i w:val="off"/>
@@ -106,7 +106,7 @@
       </w:pPr>
       <w:r>
         <w:rPr>
-          <w:rFonts w:ascii="Segoe UI" w:hAnsi="Segoe UI" w:cs="Segoe UI" w:eastAsia="Segoe UI"/>
+          <w:rFonts w:ascii="Calibri" w:hAnsi="Calibri" w:cs="Calibri" w:eastAsia="Calibri"/>
           <w:sz w:val="22"/>
           <w:b w:val="off"/>
           <w:i w:val="off"/>
@@ -122,7 +122,7 @@
       </w:pPr>
       <w:r>
         <w:rPr>
-          <w:rFonts w:ascii="Segoe UI" w:hAnsi="Segoe UI" w:cs="Segoe UI" w:eastAsia="Segoe UI"/>
+          <w:rFonts w:ascii="Calibri" w:hAnsi="Calibri" w:cs="Calibri" w:eastAsia="Calibri"/>
           <w:sz w:val="22"/>
           <w:b w:val="off"/>
           <w:i w:val="off"/>
@@ -138,7 +138,7 @@
       </w:pPr>
       <w:r>
         <w:rPr>
-          <w:rFonts w:ascii="Segoe UI" w:hAnsi="Segoe UI" w:cs="Segoe UI" w:eastAsia="Segoe UI"/>
+          <w:rFonts w:ascii="Calibri" w:hAnsi="Calibri" w:cs="Calibri" w:eastAsia="Calibri"/>
           <w:sz w:val="22"/>
           <w:b w:val="off"/>
           <w:i w:val="off"/>
@@ -155,7 +155,7 @@
       </w:pPr>
       <w:r>
         <w:rPr>
-          <w:rFonts w:ascii="Segoe UI" w:hAnsi="Segoe UI" w:cs="Segoe UI" w:eastAsia="Segoe UI"/>
+          <w:rFonts w:ascii="Calibri" w:hAnsi="Calibri" w:cs="Calibri" w:eastAsia="Calibri"/>
           <w:sz w:val="28"/>
           <w:b w:val="on"/>
           <w:i w:val="off"/>
@@ -185,7 +185,7 @@
             </w:pPr>
             <w:r>
               <w:rPr>
-                <w:rFonts w:ascii="Segoe UI" w:hAnsi="Segoe UI" w:cs="Segoe UI" w:eastAsia="Segoe UI"/>
+                <w:rFonts w:ascii="Calibri" w:hAnsi="Calibri" w:cs="Calibri" w:eastAsia="Calibri"/>
                 <w:sz w:val="22"/>
                 <w:b w:val="on"/>
                 <w:i w:val="off"/>
@@ -203,7 +203,7 @@
             </w:pPr>
             <w:r>
               <w:rPr>
-                <w:rFonts w:ascii="Segoe UI" w:hAnsi="Segoe UI" w:cs="Segoe UI" w:eastAsia="Segoe UI"/>
+                <w:rFonts w:ascii="Calibri" w:hAnsi="Calibri" w:cs="Calibri" w:eastAsia="Calibri"/>
                 <w:sz w:val="22"/>
                 <w:b w:val="on"/>
                 <w:i w:val="off"/>
@@ -221,7 +221,7 @@
             </w:pPr>
             <w:r>
               <w:rPr>
-                <w:rFonts w:ascii="Segoe UI" w:hAnsi="Segoe UI" w:cs="Segoe UI" w:eastAsia="Segoe UI"/>
+                <w:rFonts w:ascii="Calibri" w:hAnsi="Calibri" w:cs="Calibri" w:eastAsia="Calibri"/>
                 <w:sz w:val="22"/>
                 <w:b w:val="on"/>
                 <w:i w:val="off"/>
@@ -241,7 +241,7 @@
             </w:pPr>
             <w:r>
               <w:rPr>
-                <w:rFonts w:ascii="Segoe UI" w:hAnsi="Segoe UI" w:cs="Segoe UI" w:eastAsia="Segoe UI"/>
+                <w:rFonts w:ascii="Calibri" w:hAnsi="Calibri" w:cs="Calibri" w:eastAsia="Calibri"/>
                 <w:sz w:val="22"/>
                 <w:b w:val="off"/>
                 <w:i w:val="off"/>
@@ -259,7 +259,7 @@
             </w:pPr>
             <w:r>
               <w:rPr>
-                <w:rFonts w:ascii="Segoe UI" w:hAnsi="Segoe UI" w:cs="Segoe UI" w:eastAsia="Segoe UI"/>
+                <w:rFonts w:ascii="Calibri" w:hAnsi="Calibri" w:cs="Calibri" w:eastAsia="Calibri"/>
                 <w:sz w:val="22"/>
                 <w:b w:val="off"/>
                 <w:i w:val="off"/>
@@ -277,7 +277,7 @@
             </w:pPr>
             <w:r>
               <w:rPr>
-                <w:rFonts w:ascii="Segoe UI" w:hAnsi="Segoe UI" w:cs="Segoe UI" w:eastAsia="Segoe UI"/>
+                <w:rFonts w:ascii="Calibri" w:hAnsi="Calibri" w:cs="Calibri" w:eastAsia="Calibri"/>
                 <w:sz w:val="22"/>
                 <w:b w:val="off"/>
                 <w:i w:val="off"/>
@@ -297,7 +297,7 @@
             </w:pPr>
             <w:r>
               <w:rPr>
-                <w:rFonts w:ascii="Segoe UI" w:hAnsi="Segoe UI" w:cs="Segoe UI" w:eastAsia="Segoe UI"/>
+                <w:rFonts w:ascii="Calibri" w:hAnsi="Calibri" w:cs="Calibri" w:eastAsia="Calibri"/>
                 <w:sz w:val="22"/>
                 <w:b w:val="off"/>
                 <w:i w:val="off"/>
@@ -315,7 +315,7 @@
             </w:pPr>
             <w:r>
               <w:rPr>
-                <w:rFonts w:ascii="Segoe UI" w:hAnsi="Segoe UI" w:cs="Segoe UI" w:eastAsia="Segoe UI"/>
+                <w:rFonts w:ascii="Calibri" w:hAnsi="Calibri" w:cs="Calibri" w:eastAsia="Calibri"/>
                 <w:sz w:val="22"/>
                 <w:b w:val="off"/>
                 <w:i w:val="off"/>
@@ -333,7 +333,7 @@
             </w:pPr>
             <w:r>
               <w:rPr>
-                <w:rFonts w:ascii="Segoe UI" w:hAnsi="Segoe UI" w:cs="Segoe UI" w:eastAsia="Segoe UI"/>
+                <w:rFonts w:ascii="Calibri" w:hAnsi="Calibri" w:cs="Calibri" w:eastAsia="Calibri"/>
                 <w:sz w:val="22"/>
                 <w:b w:val="off"/>
                 <w:i w:val="off"/>
@@ -353,7 +353,7 @@
             </w:pPr>
             <w:r>
               <w:rPr>
-                <w:rFonts w:ascii="Segoe UI" w:hAnsi="Segoe UI" w:cs="Segoe UI" w:eastAsia="Segoe UI"/>
+                <w:rFonts w:ascii="Calibri" w:hAnsi="Calibri" w:cs="Calibri" w:eastAsia="Calibri"/>
                 <w:sz w:val="22"/>
                 <w:b w:val="off"/>
                 <w:i w:val="off"/>
@@ -371,7 +371,7 @@
             </w:pPr>
             <w:r>
               <w:rPr>
-                <w:rFonts w:ascii="Segoe UI" w:hAnsi="Segoe UI" w:cs="Segoe UI" w:eastAsia="Segoe UI"/>
+                <w:rFonts w:ascii="Calibri" w:hAnsi="Calibri" w:cs="Calibri" w:eastAsia="Calibri"/>
                 <w:sz w:val="22"/>
                 <w:b w:val="off"/>
                 <w:i w:val="off"/>
@@ -389,7 +389,7 @@
             </w:pPr>
             <w:r>
               <w:rPr>
-                <w:rFonts w:ascii="Segoe UI" w:hAnsi="Segoe UI" w:cs="Segoe UI" w:eastAsia="Segoe UI"/>
+                <w:rFonts w:ascii="Calibri" w:hAnsi="Calibri" w:cs="Calibri" w:eastAsia="Calibri"/>
                 <w:sz w:val="22"/>
                 <w:b w:val="off"/>
                 <w:i w:val="off"/>
@@ -402,6 +402,10 @@
         </w:tc>
       </w:tr>
     </w:tbl>
+    <w:sectPr>
+      <w:pgSz w:w="11906" w:h="16838"/>
+      <w:pgMar w:top="1440" w:bottom="1440" w:left="1440" w:right="1440"/>
+    </w:sectPr>
   </w:body>
 </w:document>
 </file>
</xml_diff>